<commit_message>
docs: regenerate Fine_Tuning and Provider_Aliases_User_Guide twins via claude-export-docs.sh
MD_FILE=<file> bash scripts/claude-export-docs.sh (pandoc html + weasyprint
pdf + docx), the repo own generator. The previous twins dated from Sep 5 /
Oct 4 and predated several .md edits, not only this branch.

Co-Authored-By: Claude Sonnet 5.5 <noreply@anthropic.com>
</commit_message>
<xml_diff>
--- a/docs/Provider_Aliases_User_Guide.docx
+++ b/docs/Provider_Aliases_User_Guide.docx
@@ -476,7 +476,7 @@
               <w:t xml:space="preserve"> </w:t>
             </w:r>
             <w:r>
-              <w:t xml:space="preserve">router from</w:t>
+              <w:t xml:space="preserve">router from the flat</w:t>
             </w:r>
             <w:r>
               <w:t xml:space="preserve"> </w:t>
@@ -485,10 +485,49 @@
               <w:rPr>
                 <w:rStyle w:val="VerbatimChar"/>
               </w:rPr>
-              <w:t xml:space="preserve">submodules/claude-code-router</w:t>
-            </w:r>
-            <w:r>
-              <w:t xml:space="preserve">. Do</w:t>
+              <w:t xml:space="preserve">claude_code_router</w:t>
+            </w:r>
+            <w:r>
+              <w:t xml:space="preserve"> </w:t>
+            </w:r>
+            <w:r>
+              <w:t xml:space="preserve">checkout (found by</w:t>
+            </w:r>
+            <w:r>
+              <w:t xml:space="preserve"> </w:t>
+            </w:r>
+            <w:r>
+              <w:rPr>
+                <w:rStyle w:val="VerbatimChar"/>
+              </w:rPr>
+              <w:t xml:space="preserve">scripts/resolve_deps.sh claude_code_router</w:t>
+            </w:r>
+            <w:r>
+              <w:t xml:space="preserve">:</w:t>
+            </w:r>
+            <w:r>
+              <w:t xml:space="preserve"> </w:t>
+            </w:r>
+            <w:r>
+              <w:rPr>
+                <w:rStyle w:val="VerbatimChar"/>
+              </w:rPr>
+              <w:t xml:space="preserve">CT_CLAUDE_CODE_ROUTER_DIR</w:t>
+            </w:r>
+            <w:r>
+              <w:t xml:space="preserve">, the parent hub,</w:t>
+            </w:r>
+            <w:r>
+              <w:t xml:space="preserve"> </w:t>
+            </w:r>
+            <w:r>
+              <w:rPr>
+                <w:rStyle w:val="VerbatimChar"/>
+              </w:rPr>
+              <w:t xml:space="preserve">&lt;root&gt;/submodules/</w:t>
+            </w:r>
+            <w:r>
+              <w:t xml:space="preserve">, or a sibling clone — it is not a submodule of this repo). Do</w:t>
             </w:r>
             <w:r>
               <w:t xml:space="preserve"> </w:t>
@@ -538,16 +577,22 @@
               <w:pStyle w:val="Compact"/>
             </w:pPr>
             <w:r>
+              <w:t xml:space="preserve">the</w:t>
+            </w:r>
+            <w:r>
+              <w:t xml:space="preserve"> </w:t>
+            </w:r>
+            <w:r>
               <w:rPr>
                 <w:rStyle w:val="VerbatimChar"/>
               </w:rPr>
-              <w:t xml:space="preserve">submodules/LLMsVerifier</w:t>
+              <w:t xml:space="preserve">llms_verifier</w:t>
             </w:r>
             <w:r>
               <w:t xml:space="preserve"> </w:t>
             </w:r>
             <w:r>
-              <w:t xml:space="preserve">built</w:t>
+              <w:t xml:space="preserve">(LLMsVerifier) checkout built</w:t>
             </w:r>
             <w:r>
               <w:t xml:space="preserve"> </w:t>
@@ -6293,7 +6338,46 @@
         <w:t xml:space="preserve"> </w:t>
       </w:r>
       <w:r>
-        <w:t xml:space="preserve">describe my code?") build the LLMsVerifier submodule:</w:t>
+        <w:t xml:space="preserve">describe my code?") build the LLMsVerifier checkout. It is not a submodule of</w:t>
+      </w:r>
+      <w:r>
+        <w:t xml:space="preserve"> </w:t>
+      </w:r>
+      <w:r>
+        <w:t xml:space="preserve">this repo: provide it flat (the parent hub's</w:t>
+      </w:r>
+      <w:r>
+        <w:t xml:space="preserve"> </w:t>
+      </w:r>
+      <w:r>
+        <w:rPr>
+          <w:rStyle w:val="VerbatimChar"/>
+        </w:rPr>
+        <w:t xml:space="preserve">submodules/llms_verifier</w:t>
+      </w:r>
+      <w:r>
+        <w:t xml:space="preserve">, or a</w:t>
+      </w:r>
+      <w:r>
+        <w:t xml:space="preserve"> </w:t>
+      </w:r>
+      <w:r>
+        <w:t xml:space="preserve">sibling clone) or point</w:t>
+      </w:r>
+      <w:r>
+        <w:t xml:space="preserve"> </w:t>
+      </w:r>
+      <w:r>
+        <w:rPr>
+          <w:rStyle w:val="VerbatimChar"/>
+        </w:rPr>
+        <w:t xml:space="preserve">CT_LLMS_VERIFIER_DIR</w:t>
+      </w:r>
+      <w:r>
+        <w:t xml:space="preserve"> </w:t>
+      </w:r>
+      <w:r>
+        <w:t xml:space="preserve">at it:</w:t>
       </w:r>
     </w:p>
     <w:p>
@@ -6302,89 +6386,233 @@
       </w:pPr>
       <w:r>
         <w:rPr>
+          <w:rStyle w:val="VariableTok"/>
+        </w:rPr>
+        <w:t xml:space="preserve">LV</w:t>
+      </w:r>
+      <w:r>
+        <w:rPr>
+          <w:rStyle w:val="OperatorTok"/>
+        </w:rPr>
+        <w:t xml:space="preserve">=</w:t>
+      </w:r>
+      <w:r>
+        <w:rPr>
+          <w:rStyle w:val="StringTok"/>
+        </w:rPr>
+        <w:t xml:space="preserve">"</w:t>
+      </w:r>
+      <w:r>
+        <w:rPr>
+          <w:rStyle w:val="VariableTok"/>
+        </w:rPr>
+        <w:t xml:space="preserve">$(</w:t>
+      </w:r>
+      <w:r>
+        <w:rPr>
           <w:rStyle w:val="FunctionTok"/>
         </w:rPr>
+        <w:t xml:space="preserve">bash</w:t>
+      </w:r>
+      <w:r>
+        <w:rPr>
+          <w:rStyle w:val="NormalTok"/>
+        </w:rPr>
+        <w:t xml:space="preserve"> scripts/resolve_deps.sh llms_verifier</w:t>
+      </w:r>
+      <w:r>
+        <w:rPr>
+          <w:rStyle w:val="VariableTok"/>
+        </w:rPr>
+        <w:t xml:space="preserve">)</w:t>
+      </w:r>
+      <w:r>
+        <w:rPr>
+          <w:rStyle w:val="StringTok"/>
+        </w:rPr>
+        <w:t xml:space="preserve">"</w:t>
+      </w:r>
+      <w:r>
+        <w:rPr>
+          <w:rStyle w:val="NormalTok"/>
+        </w:rPr>
+        <w:t xml:space="preserve"> </w:t>
+      </w:r>
+      <w:r>
+        <w:rPr>
+          <w:rStyle w:val="DataTypeTok"/>
+        </w:rPr>
+        <w:t xml:space="preserve">\</w:t>
+      </w:r>
+      <w:r>
+        <w:br/>
+      </w:r>
+      <w:r>
+        <w:rPr>
+          <w:rStyle w:val="NormalTok"/>
+        </w:rPr>
+        <w:t xml:space="preserve">  </w:t>
+      </w:r>
+      <w:r>
+        <w:rPr>
+          <w:rStyle w:val="KeywordTok"/>
+        </w:rPr>
+        <w:t xml:space="preserve">||</w:t>
+      </w:r>
+      <w:r>
+        <w:rPr>
+          <w:rStyle w:val="NormalTok"/>
+        </w:rPr>
+        <w:t xml:space="preserve"> </w:t>
+      </w:r>
+      <w:r>
+        <w:rPr>
+          <w:rStyle w:val="FunctionTok"/>
+        </w:rPr>
         <w:t xml:space="preserve">git</w:t>
       </w:r>
       <w:r>
         <w:rPr>
           <w:rStyle w:val="NormalTok"/>
         </w:rPr>
-        <w:t xml:space="preserve"> submodule update </w:t>
+        <w:t xml:space="preserve"> clone </w:t>
       </w:r>
       <w:r>
         <w:rPr>
           <w:rStyle w:val="AttributeTok"/>
         </w:rPr>
-        <w:t xml:space="preserve">--init</w:t>
+        <w:t xml:space="preserve">--depth</w:t>
       </w:r>
       <w:r>
         <w:rPr>
           <w:rStyle w:val="NormalTok"/>
         </w:rPr>
-        <w:t xml:space="preserve"> </w:t>
+        <w:t xml:space="preserve"> 1 git@github.com:vasic-digital/LLMsVerifier.git ../llms_verifier</w:t>
+      </w:r>
+      <w:r>
+        <w:br/>
+      </w:r>
+      <w:r>
+        <w:rPr>
+          <w:rStyle w:val="VariableTok"/>
+        </w:rPr>
+        <w:t xml:space="preserve">LV</w:t>
+      </w:r>
+      <w:r>
+        <w:rPr>
+          <w:rStyle w:val="OperatorTok"/>
+        </w:rPr>
+        <w:t xml:space="preserve">=</w:t>
+      </w:r>
+      <w:r>
+        <w:rPr>
+          <w:rStyle w:val="StringTok"/>
+        </w:rPr>
+        <w:t xml:space="preserve">"</w:t>
+      </w:r>
+      <w:r>
+        <w:rPr>
+          <w:rStyle w:val="VariableTok"/>
+        </w:rPr>
+        <w:t xml:space="preserve">$(</w:t>
+      </w:r>
+      <w:r>
+        <w:rPr>
+          <w:rStyle w:val="FunctionTok"/>
+        </w:rPr>
+        <w:t xml:space="preserve">bash</w:t>
+      </w:r>
+      <w:r>
+        <w:rPr>
+          <w:rStyle w:val="NormalTok"/>
+        </w:rPr>
+        <w:t xml:space="preserve"> scripts/resolve_deps.sh llms_verifier</w:t>
+      </w:r>
+      <w:r>
+        <w:rPr>
+          <w:rStyle w:val="VariableTok"/>
+        </w:rPr>
+        <w:t xml:space="preserve">)</w:t>
+      </w:r>
+      <w:r>
+        <w:rPr>
+          <w:rStyle w:val="StringTok"/>
+        </w:rPr>
+        <w:t xml:space="preserve">"</w:t>
+      </w:r>
+      <w:r>
+        <w:br/>
+      </w:r>
+      <w:r>
+        <w:rPr>
+          <w:rStyle w:val="BuiltInTok"/>
+        </w:rPr>
+        <w:t xml:space="preserve">cd</w:t>
+      </w:r>
+      <w:r>
+        <w:rPr>
+          <w:rStyle w:val="NormalTok"/>
+        </w:rPr>
+        <w:t xml:space="preserve"> </w:t>
+      </w:r>
+      <w:r>
+        <w:rPr>
+          <w:rStyle w:val="StringTok"/>
+        </w:rPr>
+        <w:t xml:space="preserve">"</w:t>
+      </w:r>
+      <w:r>
+        <w:rPr>
+          <w:rStyle w:val="VariableTok"/>
+        </w:rPr>
+        <w:t xml:space="preserve">$LV</w:t>
+      </w:r>
+      <w:r>
+        <w:rPr>
+          <w:rStyle w:val="StringTok"/>
+        </w:rPr>
+        <w:t xml:space="preserve">"</w:t>
+      </w:r>
+      <w:r>
+        <w:rPr>
+          <w:rStyle w:val="NormalTok"/>
+        </w:rPr>
+        <w:t xml:space="preserve"> </w:t>
+      </w:r>
+      <w:r>
+        <w:rPr>
+          <w:rStyle w:val="KeywordTok"/>
+        </w:rPr>
+        <w:t xml:space="preserve">&amp;&amp;</w:t>
+      </w:r>
+      <w:r>
+        <w:rPr>
+          <w:rStyle w:val="NormalTok"/>
+        </w:rPr>
+        <w:t xml:space="preserve"> </w:t>
+      </w:r>
+      <w:r>
+        <w:rPr>
+          <w:rStyle w:val="ExtensionTok"/>
+        </w:rPr>
+        <w:t xml:space="preserve">go</w:t>
+      </w:r>
+      <w:r>
+        <w:rPr>
+          <w:rStyle w:val="NormalTok"/>
+        </w:rPr>
+        <w:t xml:space="preserve"> build </w:t>
       </w:r>
       <w:r>
         <w:rPr>
           <w:rStyle w:val="AttributeTok"/>
         </w:rPr>
-        <w:t xml:space="preserve">--depth</w:t>
+        <w:t xml:space="preserve">-o</w:t>
       </w:r>
       <w:r>
         <w:rPr>
           <w:rStyle w:val="NormalTok"/>
         </w:rPr>
-        <w:t xml:space="preserve"> 1 submodules/LLMsVerifier</w:t>
-      </w:r>
-      <w:r>
-        <w:br/>
-      </w:r>
-      <w:r>
-        <w:rPr>
-          <w:rStyle w:val="BuiltInTok"/>
-        </w:rPr>
-        <w:t xml:space="preserve">cd</w:t>
-      </w:r>
-      <w:r>
-        <w:rPr>
-          <w:rStyle w:val="NormalTok"/>
-        </w:rPr>
-        <w:t xml:space="preserve"> submodules/LLMsVerifier </w:t>
-      </w:r>
-      <w:r>
-        <w:rPr>
-          <w:rStyle w:val="KeywordTok"/>
-        </w:rPr>
-        <w:t xml:space="preserve">&amp;&amp;</w:t>
-      </w:r>
-      <w:r>
-        <w:rPr>
-          <w:rStyle w:val="NormalTok"/>
-        </w:rPr>
-        <w:t xml:space="preserve"> </w:t>
-      </w:r>
-      <w:r>
-        <w:rPr>
-          <w:rStyle w:val="ExtensionTok"/>
-        </w:rPr>
-        <w:t xml:space="preserve">go</w:t>
-      </w:r>
-      <w:r>
-        <w:rPr>
-          <w:rStyle w:val="NormalTok"/>
-        </w:rPr>
-        <w:t xml:space="preserve"> build </w:t>
-      </w:r>
-      <w:r>
-        <w:rPr>
-          <w:rStyle w:val="AttributeTok"/>
-        </w:rPr>
-        <w:t xml:space="preserve">-o</w:t>
-      </w:r>
-      <w:r>
-        <w:rPr>
-          <w:rStyle w:val="NormalTok"/>
-        </w:rPr>
         <w:t xml:space="preserve"> bin/model-verification ./llm-verifier/cmd/model-verification</w:t>
       </w:r>
     </w:p>
@@ -6402,7 +6630,7 @@
         <w:rPr>
           <w:rStyle w:val="VerbatimChar"/>
         </w:rPr>
-        <w:t xml:space="preserve">submodules/LLMsVerifier/bin/model-verification</w:t>
+        <w:t xml:space="preserve">&lt;llms_verifier&gt;/bin/model-verification</w:t>
       </w:r>
       <w:r>
         <w:t xml:space="preserve"> </w:t>
@@ -8470,7 +8698,7 @@
         <w:rPr>
           <w:rStyle w:val="VerbatimChar"/>
         </w:rPr>
-        <w:t xml:space="preserve">submodules/claude-code-router/internal/router/selector.go</w:t>
+        <w:t xml:space="preserve">claude-code-router:internal/router/selector.go</w:t>
       </w:r>
       <w:r>
         <w:t xml:space="preserve">).</w:t>
@@ -28828,7 +29056,7 @@
         <w:t xml:space="preserve"> </w:t>
       </w:r>
       <w:r>
-        <w:t xml:space="preserve">— both can use LLMsVerifier submodule</w:t>
+        <w:t xml:space="preserve">— both can use the LLMsVerifier checkout</w:t>
       </w:r>
     </w:p>
     <w:p>

</xml_diff>